<commit_message>
Cap nhat MSSV N24DCDT001: sinh lai du lieu ca nhan, cap nhat phieu thuc hanh va bao cao
</commit_message>
<xml_diff>
--- a/Phieu_thuc_hanh_CTDL_GT_2026_10_09.docx
+++ b/Phieu_thuc_hanh_CTDL_GT_2026_10_09.docx
@@ -12,12 +12,12 @@
     </w:p>
     <w:p>
       <w:r>
-        <w:t>Họ tên: Huỳnh Nguyễn Tiến Anh          MSSV: N24DCDT081          Lớp: D24CQDT01-N</w:t>
+        <w:t>Họ tên: Huỳnh Nguyễn Tiến Anh          MSSV: N24DCDT001          Lớp: D24CQDT01-N</w:t>
       </w:r>
     </w:p>
     <w:p>
       <w:r>
-        <w:t>GitHub: https://github.com/anhtienhao66a-dotcom/thuchanhbuoi5.git          Commit SHA: 0a8320e136c71e95c74aa361b9f03237d766551d</w:t>
+        <w:t>GitHub: https://github.com/anhtienhao66a-dotcom/thuchanhbuoi5.git          Commit SHA: (Xem commit HEAD trên GitHub)</w:t>
       </w:r>
     </w:p>
     <w:p>
@@ -369,7 +369,7 @@
         <w:br/>
         <w:t xml:space="preserve">  + Đối chiếu vét cạn: Xét 2^3 = 8 tập con, tập {1, 2} có tổng chi phí 8, lợi ích 14 là tối ưu nhất; kết quả DP hoàn toàn trùng khớp.</w:t>
         <w:br/>
-        <w:t>- Bộ mở rộng cá nhân MSSV N24DCDT081: n = 10 đơn, ngân sách B = 28. Tập chọn: [4, 5, 8, 2], tổng chi phí = 27 &lt;= 28, tổng lợi ích = 50. DP = 50, Vét cạn = 50, Tham lam = 49 (minh chứng tham lam không tối ưu toàn cục).</w:t>
+        <w:t>- Bộ mở rộng cá nhân MSSV N24DCDT001: n = 8 đơn, ngân sách B = 28. Tập chọn: [2, 8, 5, 4, 3, 7], tổng chi phí = 26 &lt;= 28, tổng lợi ích = 45. DP = 45, Vét cạn = 45, Tham lam = 45.</w:t>
       </w:r>
     </w:p>
     <w:p>
@@ -639,7 +639,7 @@
     </w:p>
     <w:p>
       <w:r>
-        <w:t>Đường dẫn CSV kết quả: data/MINI001/ket_qua.csv và data/N24DCDT081/ket_qua.csv    Link notebook: TH_2026_10_09_Pluto.jl</w:t>
+        <w:t>Đường dẫn CSV kết quả: data/MINI001/ket_qua.csv và data/N24DCDT001/ket_qua.csv    Link notebook: TH_2026_10_09_Pluto.jl</w:t>
       </w:r>
     </w:p>
     <w:p>

</xml_diff>